<commit_message>
Modify readme, Words and add new RDP
</commit_message>
<xml_diff>
--- a/fil rouge dev2 (Infra)/VM Cloud/Compte_Rendu_VM_Cloud.docx
+++ b/fil rouge dev2 (Infra)/VM Cloud/Compte_Rendu_VM_Cloud.docx
@@ -118,7 +118,13 @@
         <w:jc w:val="both"/>
       </w:pPr>
       <w:r>
-        <w:t xml:space="preserve">Introduction : Dans ce TP, nous allons </w:t>
+        <w:t xml:space="preserve">Introduction : Dans ce </w:t>
+      </w:r>
+      <w:r>
+        <w:t>projet</w:t>
+      </w:r>
+      <w:r>
+        <w:t xml:space="preserve">, nous allons </w:t>
       </w:r>
       <w:r>
         <w:t>créer</w:t>
@@ -611,15 +617,7 @@
         <w:jc w:val="both"/>
       </w:pPr>
       <w:r>
-        <w:t xml:space="preserve">Image 18 : </w:t>
-      </w:r>
-      <w:proofErr w:type="spellStart"/>
-      <w:r>
-        <w:t>Task</w:t>
-      </w:r>
-      <w:proofErr w:type="spellEnd"/>
-      <w:r>
-        <w:t xml:space="preserve"> Scheduler……………………...……………………..………………..…………………1</w:t>
+        <w:t>Image 18 : Task Scheduler……………………...……………………..………………..…………………1</w:t>
       </w:r>
       <w:r>
         <w:t>1</w:t>
@@ -2000,15 +1998,7 @@
         <w:jc w:val="both"/>
       </w:pPr>
       <w:r>
-        <w:t xml:space="preserve">Avant de mettre en place Active Directory, il faut créer un domaine que nous nommerons « </w:t>
-      </w:r>
-      <w:proofErr w:type="spellStart"/>
-      <w:r>
-        <w:t>yplaza.local</w:t>
-      </w:r>
-      <w:proofErr w:type="spellEnd"/>
-      <w:r>
-        <w:t xml:space="preserve"> ».</w:t>
+        <w:t>Avant de mettre en place Active Directory, il faut créer un domaine que nous nommerons « yplaza.local ».</w:t>
       </w:r>
     </w:p>
     <w:p>
@@ -2457,11 +2447,9 @@
       <w:r>
         <w:t xml:space="preserve"> </w:t>
       </w:r>
-      <w:proofErr w:type="spellStart"/>
       <w:r>
         <w:t>Robocopy</w:t>
       </w:r>
-      <w:proofErr w:type="spellEnd"/>
       <w:r>
         <w:t>, qui servira également pour la sauvegarde automatique des données.</w:t>
       </w:r>
@@ -3924,15 +3912,13 @@
         <w:jc w:val="both"/>
       </w:pPr>
       <w:r>
-        <w:t xml:space="preserve">Ce TP nous a permis de mettre en place une infrastructure réseau complète en environnement virtualisé, proche de celle d’une entreprise. Nous avons configuré un serveur Windows avec Active Directory, créé le domaine </w:t>
-      </w:r>
-      <w:proofErr w:type="spellStart"/>
-      <w:r>
-        <w:t>yplaza.local</w:t>
-      </w:r>
-      <w:proofErr w:type="spellEnd"/>
-      <w:r>
-        <w:t xml:space="preserve"> ainsi que les utilisateurs, groupes et droits d’accès associés.</w:t>
+        <w:t xml:space="preserve">Ce </w:t>
+      </w:r>
+      <w:r>
+        <w:t>projet</w:t>
+      </w:r>
+      <w:r>
+        <w:t xml:space="preserve"> nous a permis de mettre en place une infrastructure réseau complète en environnement virtualisé, proche de celle d’une entreprise. Nous avons configuré un serveur Windows avec Active Directory, créé le domaine yplaza.local ainsi que les utilisateurs, groupes et droits d’accès associés.</w:t>
       </w:r>
       <w:r>
         <w:t xml:space="preserve"> </w:t>
@@ -3952,15 +3938,7 @@
         <w:t>d</w:t>
       </w:r>
       <w:r>
-        <w:t xml:space="preserve">es scripts PowerShell ont permis d’automatiser la gestion des comptes et des dossiers partagés. Une solution de sauvegarde avec </w:t>
-      </w:r>
-      <w:proofErr w:type="spellStart"/>
-      <w:r>
-        <w:t>Robocopy</w:t>
-      </w:r>
-      <w:proofErr w:type="spellEnd"/>
-      <w:r>
-        <w:t xml:space="preserve"> a été mise en place et automatisée grâce au Planificateur de tâches, tout en conservant les permissions NTFS. </w:t>
+        <w:t xml:space="preserve">es scripts PowerShell ont permis d’automatiser la gestion des comptes et des dossiers partagés. Une solution de sauvegarde avec Robocopy a été mise en place et automatisée grâce au Planificateur de tâches, tout en conservant les permissions NTFS. </w:t>
       </w:r>
     </w:p>
     <w:p>
@@ -3971,15 +3949,7 @@
         <w:t>Ensuite, u</w:t>
       </w:r>
       <w:r>
-        <w:t xml:space="preserve">n VPN </w:t>
-      </w:r>
-      <w:proofErr w:type="spellStart"/>
-      <w:r>
-        <w:t>WireGuard</w:t>
-      </w:r>
-      <w:proofErr w:type="spellEnd"/>
-      <w:r>
-        <w:t xml:space="preserve"> a également été configuré afin de sécuriser les échanges entre les machines. Enfin, les GPO ont permis d’appliquer des politiques de sécurité centralisées, notamment la restriction du panneau de configuration selon les groupes. </w:t>
+        <w:t xml:space="preserve">n VPN WireGuard a également été configuré afin de sécuriser les échanges entre les machines. Enfin, les GPO ont permis d’appliquer des politiques de sécurité centralisées, notamment la restriction du panneau de configuration selon les groupes. </w:t>
       </w:r>
       <w:r>
         <w:t>En somm</w:t>
@@ -4706,6 +4676,7 @@
   <w:style w:type="character" w:default="1" w:styleId="Policepardfaut">
     <w:name w:val="Default Paragraph Font"/>
     <w:uiPriority w:val="1"/>
+    <w:semiHidden/>
     <w:unhideWhenUsed/>
   </w:style>
   <w:style w:type="table" w:default="1" w:styleId="TableauNormal">

</xml_diff>